<commit_message>
Budget Forecast 2YF v2.4: one button on the existing screen, menu screen in the new program
- ZFI_BUDGET_PREPERATION screen 0001 gets only one button FCST_MAIN
  (Budget Forecast) calling the new transaction ZFI_BUD_2YF.
- New menu screen 0001 in ZFI_BUD_2YF_ENTRY with three role-based
  buttons (create / display-modify / report), controlled by
  LCL_MENU_0001; screen 0100 controller takes the mode as parameter.
- Change document, TSD and README updated.

Co-Authored-By: Claude Opus 5.5 <noreply@anthropic.com>
Claude-Session: https://claude.ai/code/session_018v514gXErg4EbBGrdeHBh4
</commit_message>
<xml_diff>
--- a/budget_forecast/Change Document - Existing Budget Preparation Cycle (ZFI_BUDGET_PREPERATION).docx
+++ b/budget_forecast/Change Document - Existing Budget Preparation Cycle (ZFI_BUDGET_PREPERATION).docx
@@ -240,7 +240,7 @@
           </w:tcPr>
           <w:p>
             <w:r>
-              <w:t xml:space="preserve">Transactions ZFI_BUD_2YF_C / ZFI_BUD_2YF_M / ZFI_BUD_2YF_R, classes ZCL_FI_BUD_2YF_AUTH and ZCL_FI_BUD_2YF_REPOSITORY</w:t>
+              <w:t xml:space="preserve">Transaction ZFI_BUD_2YF (menu of the new program ZFI_BUD_2YF_ENTRY), classes ZCL_FI_BUD_2YF_AUTH and ZCL_FI_BUD_2YF_REPOSITORY</w:t>
             </w:r>
           </w:p>
         </w:tc>
@@ -516,7 +516,7 @@
           </w:tcPr>
           <w:p>
             <w:r>
-              <w:t xml:space="preserve">1.1 – 08.10.2026</w:t>
+              <w:t xml:space="preserve">1.2 – 08.10.2026 (one button)</w:t>
             </w:r>
           </w:p>
         </w:tc>
@@ -608,7 +608,27 @@
         <w:t xml:space="preserve">only</w:t>
       </w:r>
       <w:r>
-        <w:t xml:space="preserve"> through three new buttons on the main screen 0001 of ZFI_BUDGET_PREPERATION. This document lists every manual change to the existing program, step by step.</w:t>
+        <w:t xml:space="preserve"> through </w:t>
+      </w:r>
+      <w:r>
+        <w:rPr>
+          <w:b/>
+          <w:bCs/>
+        </w:rPr>
+        <w:t xml:space="preserve">one</w:t>
+      </w:r>
+      <w:r>
+        <w:t xml:space="preserve"> new button </w:t>
+      </w:r>
+      <w:r>
+        <w:rPr>
+          <w:b/>
+          <w:bCs/>
+        </w:rPr>
+        <w:t xml:space="preserve">Budget Forecast</w:t>
+      </w:r>
+      <w:r>
+        <w:t xml:space="preserve"> on the main screen 0001 of ZFI_BUDGET_PREPERATION. The button opens the menu of the new program, which shows the buttons Create Budget Forecast, Display / Modify Budget Forecast and Forecast Report according to the role of the user – these three buttons are on the own screen of the new program, not on the existing screen. This document lists every manual change to the existing program, step by step.</w:t>
       </w:r>
     </w:p>
     <w:p>
@@ -785,7 +805,7 @@
           </w:tcPr>
           <w:p>
             <w:r>
-              <w:t xml:space="preserve">New frame FCST_FRAME "Budget Forecast" with three pushbuttons FCST_CREATE, FCST_CHANGE, FCST_REPORT to the right of "Select Process"</w:t>
+              <w:t xml:space="preserve">New frame FCST_FRAME "Budget Forecast" with ONE pushbutton FCST_MAIN to the right of "Select Process"</w:t>
             </w:r>
           </w:p>
         </w:tc>
@@ -853,7 +873,7 @@
           </w:tcPr>
           <w:p>
             <w:r>
-              <w:t xml:space="preserve">One new block before ENDMODULE: shows each new button only to the authorized users</w:t>
+              <w:t xml:space="preserve">One small block before ENDMODULE: hides the button for users without any forecast role</w:t>
             </w:r>
           </w:p>
         </w:tc>
@@ -921,7 +941,7 @@
           </w:tcPr>
           <w:p>
             <w:r>
-              <w:t xml:space="preserve">Three new WHEN branches: start the new transactions</w:t>
+              <w:t xml:space="preserve">One new WHEN branch FCST_MAIN: calls transaction ZFI_BUD_2YF</w:t>
             </w:r>
           </w:p>
         </w:tc>
@@ -1028,7 +1048,7 @@
         <w:spacing w:after="100"/>
       </w:pPr>
       <w:r>
-        <w:t xml:space="preserve">Install the new Budget Forecast objects first (TSD "Budget Forecast 2YF", Part A) and test the three transactions directly. Only then connect them here.</w:t>
+        <w:t xml:space="preserve">Install the new Budget Forecast objects first (TSD "Budget Forecast 2YF", Part A) and test transaction ZFI_BUD_2YF directly (menu with the role-based buttons). Only then connect it here.</w:t>
       </w:r>
     </w:p>
     <w:tbl>
@@ -1217,7 +1237,7 @@
           </w:tcPr>
           <w:p>
             <w:r>
-              <w:t xml:space="preserve">Transactions ZFI_BUD_2YF_C, ZFI_BUD_2YF_M, ZFI_BUD_2YF_R</w:t>
+              <w:t xml:space="preserve">Transaction ZFI_BUD_2YF (program ZFI_BUD_2YF_ENTRY, screen 0001)</w:t>
             </w:r>
           </w:p>
         </w:tc>
@@ -1297,7 +1317,7 @@
         <w:pStyle w:val="Heading1"/>
       </w:pPr>
       <w:r>
-        <w:t xml:space="preserve">4. Step 2 – Screen 0001: three new buttons</w:t>
+        <w:t xml:space="preserve">4. Step 2 – Screen 0001: one new button</w:t>
       </w:r>
     </w:p>
     <w:p>
@@ -1331,7 +1351,7 @@
         <w:spacing w:after="60"/>
       </w:pPr>
       <w:r>
-        <w:t xml:space="preserve">Utilities → More Utilities → Upload → file ZFI_BUDGET_PREPERATION_0001_with_forecast_buttons.txt (folder 02_CHANGES_TO_EXISTING_ZFI_BUDGET_PREPERATION of the package).</w:t>
+        <w:t xml:space="preserve">Utilities → More Utilities → Upload → file ZFI_BUDGET_PREPERATION_0001_with_forecast_button.txt (folder 02_CHANGES_TO_EXISTING_ZFI_BUDGET_PREPERATION of the package).</w:t>
       </w:r>
     </w:p>
     <w:p>
@@ -1344,7 +1364,7 @@
         <w:spacing w:after="60"/>
       </w:pPr>
       <w:r>
-        <w:t xml:space="preserve">The file is the current screen 0001 unchanged plus the new frame and buttons; the screen width changes from 29 to 62 columns. Flow logic unchanged.</w:t>
+        <w:t xml:space="preserve">The file is the current screen 0001 unchanged plus the new frame and the one button; the screen width changes from 29 to 62 columns. Flow logic unchanged.</w:t>
       </w:r>
     </w:p>
     <w:p>
@@ -1404,7 +1424,7 @@
         <w:spacing w:after="60"/>
       </w:pPr>
       <w:r>
-        <w:t xml:space="preserve">Draw a box at line 1, column 33, width 29, height 17, name FCST_FRAME, text "Budget Forecast".</w:t>
+        <w:t xml:space="preserve">Draw a box at line 1, column 33, width 29, height 5, name FCST_FRAME, text "Budget Forecast".</w:t>
       </w:r>
     </w:p>
     <w:p>
@@ -1417,7 +1437,7 @@
         <w:spacing w:after="60"/>
       </w:pPr>
       <w:r>
-        <w:t xml:space="preserve">Inside the box add three pushbuttons with the attributes below (same size and icons as the existing buttons).</w:t>
+        <w:t xml:space="preserve">Inside the box add one pushbutton with the attributes below (same size and icon style as the existing buttons).</w:t>
       </w:r>
     </w:p>
     <w:p>
@@ -1639,7 +1659,7 @@
           </w:tcPr>
           <w:p>
             <w:r>
-              <w:t xml:space="preserve">FCST_CREATE</w:t>
+              <w:t xml:space="preserve">FCST_MAIN</w:t>
             </w:r>
           </w:p>
         </w:tc>
@@ -1661,7 +1681,7 @@
           </w:tcPr>
           <w:p>
             <w:r>
-              <w:t xml:space="preserve">Create Forecast</w:t>
+              <w:t xml:space="preserve">Budget Forecast</w:t>
             </w:r>
           </w:p>
         </w:tc>
@@ -1683,7 +1703,7 @@
           </w:tcPr>
           <w:p>
             <w:r>
-              <w:t xml:space="preserve">ICON_CREATE</w:t>
+              <w:t xml:space="preserve">ICON_CREATE (or any)</w:t>
             </w:r>
           </w:p>
         </w:tc>
@@ -1705,7 +1725,7 @@
           </w:tcPr>
           <w:p>
             <w:r>
-              <w:t xml:space="preserve">FCST_CREATE</w:t>
+              <w:t xml:space="preserve">FCST_MAIN</w:t>
             </w:r>
           </w:p>
         </w:tc>
@@ -1728,274 +1748,6 @@
           <w:p>
             <w:r>
               <w:t xml:space="preserve">3 / 38</w:t>
-            </w:r>
-          </w:p>
-        </w:tc>
-        <w:tc>
-          <w:tcPr>
-            <w:tcW w:type="dxa" w:w="1493"/>
-            <w:tcBorders>
-              <w:top w:val="single" w:color="999999" w:sz="4"/>
-              <w:left w:val="single" w:color="999999" w:sz="4"/>
-              <w:bottom w:val="single" w:color="999999" w:sz="4"/>
-              <w:right w:val="single" w:color="999999" w:sz="4"/>
-            </w:tcBorders>
-            <w:tcMar>
-              <w:top w:type="dxa" w:w="50"/>
-              <w:left w:type="dxa" w:w="90"/>
-              <w:bottom w:type="dxa" w:w="50"/>
-              <w:right w:type="dxa" w:w="90"/>
-            </w:tcMar>
-          </w:tcPr>
-          <w:p>
-            <w:r>
-              <w:t xml:space="preserve">19</w:t>
-            </w:r>
-          </w:p>
-        </w:tc>
-      </w:tr>
-      <w:tr>
-        <w:tc>
-          <w:tcPr>
-            <w:tcW w:type="dxa" w:w="1589"/>
-            <w:tcBorders>
-              <w:top w:val="single" w:color="999999" w:sz="4"/>
-              <w:left w:val="single" w:color="999999" w:sz="4"/>
-              <w:bottom w:val="single" w:color="999999" w:sz="4"/>
-              <w:right w:val="single" w:color="999999" w:sz="4"/>
-            </w:tcBorders>
-            <w:tcMar>
-              <w:top w:type="dxa" w:w="50"/>
-              <w:left w:type="dxa" w:w="90"/>
-              <w:bottom w:type="dxa" w:w="50"/>
-              <w:right w:type="dxa" w:w="90"/>
-            </w:tcMar>
-          </w:tcPr>
-          <w:p>
-            <w:r>
-              <w:t xml:space="preserve">FCST_CHANGE</w:t>
-            </w:r>
-          </w:p>
-        </w:tc>
-        <w:tc>
-          <w:tcPr>
-            <w:tcW w:type="dxa" w:w="1788"/>
-            <w:tcBorders>
-              <w:top w:val="single" w:color="999999" w:sz="4"/>
-              <w:left w:val="single" w:color="999999" w:sz="4"/>
-              <w:bottom w:val="single" w:color="999999" w:sz="4"/>
-              <w:right w:val="single" w:color="999999" w:sz="4"/>
-            </w:tcBorders>
-            <w:tcMar>
-              <w:top w:type="dxa" w:w="50"/>
-              <w:left w:type="dxa" w:w="90"/>
-              <w:bottom w:type="dxa" w:w="50"/>
-              <w:right w:type="dxa" w:w="90"/>
-            </w:tcMar>
-          </w:tcPr>
-          <w:p>
-            <w:r>
-              <w:t xml:space="preserve">Change Forecast</w:t>
-            </w:r>
-          </w:p>
-        </w:tc>
-        <w:tc>
-          <w:tcPr>
-            <w:tcW w:type="dxa" w:w="1987"/>
-            <w:tcBorders>
-              <w:top w:val="single" w:color="999999" w:sz="4"/>
-              <w:left w:val="single" w:color="999999" w:sz="4"/>
-              <w:bottom w:val="single" w:color="999999" w:sz="4"/>
-              <w:right w:val="single" w:color="999999" w:sz="4"/>
-            </w:tcBorders>
-            <w:tcMar>
-              <w:top w:type="dxa" w:w="50"/>
-              <w:left w:type="dxa" w:w="90"/>
-              <w:bottom w:type="dxa" w:w="50"/>
-              <w:right w:type="dxa" w:w="90"/>
-            </w:tcMar>
-          </w:tcPr>
-          <w:p>
-            <w:r>
-              <w:t xml:space="preserve">ICON_CHANGE</w:t>
-            </w:r>
-          </w:p>
-        </w:tc>
-        <w:tc>
-          <w:tcPr>
-            <w:tcW w:type="dxa" w:w="1589"/>
-            <w:tcBorders>
-              <w:top w:val="single" w:color="999999" w:sz="4"/>
-              <w:left w:val="single" w:color="999999" w:sz="4"/>
-              <w:bottom w:val="single" w:color="999999" w:sz="4"/>
-              <w:right w:val="single" w:color="999999" w:sz="4"/>
-            </w:tcBorders>
-            <w:tcMar>
-              <w:top w:type="dxa" w:w="50"/>
-              <w:left w:type="dxa" w:w="90"/>
-              <w:bottom w:type="dxa" w:w="50"/>
-              <w:right w:type="dxa" w:w="90"/>
-            </w:tcMar>
-          </w:tcPr>
-          <w:p>
-            <w:r>
-              <w:t xml:space="preserve">FCST_CHANGE</w:t>
-            </w:r>
-          </w:p>
-        </w:tc>
-        <w:tc>
-          <w:tcPr>
-            <w:tcW w:type="dxa" w:w="1490"/>
-            <w:tcBorders>
-              <w:top w:val="single" w:color="999999" w:sz="4"/>
-              <w:left w:val="single" w:color="999999" w:sz="4"/>
-              <w:bottom w:val="single" w:color="999999" w:sz="4"/>
-              <w:right w:val="single" w:color="999999" w:sz="4"/>
-            </w:tcBorders>
-            <w:tcMar>
-              <w:top w:type="dxa" w:w="50"/>
-              <w:left w:type="dxa" w:w="90"/>
-              <w:bottom w:type="dxa" w:w="50"/>
-              <w:right w:type="dxa" w:w="90"/>
-            </w:tcMar>
-          </w:tcPr>
-          <w:p>
-            <w:r>
-              <w:t xml:space="preserve">6 / 38</w:t>
-            </w:r>
-          </w:p>
-        </w:tc>
-        <w:tc>
-          <w:tcPr>
-            <w:tcW w:type="dxa" w:w="1493"/>
-            <w:tcBorders>
-              <w:top w:val="single" w:color="999999" w:sz="4"/>
-              <w:left w:val="single" w:color="999999" w:sz="4"/>
-              <w:bottom w:val="single" w:color="999999" w:sz="4"/>
-              <w:right w:val="single" w:color="999999" w:sz="4"/>
-            </w:tcBorders>
-            <w:tcMar>
-              <w:top w:type="dxa" w:w="50"/>
-              <w:left w:type="dxa" w:w="90"/>
-              <w:bottom w:type="dxa" w:w="50"/>
-              <w:right w:type="dxa" w:w="90"/>
-            </w:tcMar>
-          </w:tcPr>
-          <w:p>
-            <w:r>
-              <w:t xml:space="preserve">19</w:t>
-            </w:r>
-          </w:p>
-        </w:tc>
-      </w:tr>
-      <w:tr>
-        <w:tc>
-          <w:tcPr>
-            <w:tcW w:type="dxa" w:w="1589"/>
-            <w:tcBorders>
-              <w:top w:val="single" w:color="999999" w:sz="4"/>
-              <w:left w:val="single" w:color="999999" w:sz="4"/>
-              <w:bottom w:val="single" w:color="999999" w:sz="4"/>
-              <w:right w:val="single" w:color="999999" w:sz="4"/>
-            </w:tcBorders>
-            <w:tcMar>
-              <w:top w:type="dxa" w:w="50"/>
-              <w:left w:type="dxa" w:w="90"/>
-              <w:bottom w:type="dxa" w:w="50"/>
-              <w:right w:type="dxa" w:w="90"/>
-            </w:tcMar>
-          </w:tcPr>
-          <w:p>
-            <w:r>
-              <w:t xml:space="preserve">FCST_REPORT</w:t>
-            </w:r>
-          </w:p>
-        </w:tc>
-        <w:tc>
-          <w:tcPr>
-            <w:tcW w:type="dxa" w:w="1788"/>
-            <w:tcBorders>
-              <w:top w:val="single" w:color="999999" w:sz="4"/>
-              <w:left w:val="single" w:color="999999" w:sz="4"/>
-              <w:bottom w:val="single" w:color="999999" w:sz="4"/>
-              <w:right w:val="single" w:color="999999" w:sz="4"/>
-            </w:tcBorders>
-            <w:tcMar>
-              <w:top w:type="dxa" w:w="50"/>
-              <w:left w:type="dxa" w:w="90"/>
-              <w:bottom w:type="dxa" w:w="50"/>
-              <w:right w:type="dxa" w:w="90"/>
-            </w:tcMar>
-          </w:tcPr>
-          <w:p>
-            <w:r>
-              <w:t xml:space="preserve">Forecast Report</w:t>
-            </w:r>
-          </w:p>
-        </w:tc>
-        <w:tc>
-          <w:tcPr>
-            <w:tcW w:type="dxa" w:w="1987"/>
-            <w:tcBorders>
-              <w:top w:val="single" w:color="999999" w:sz="4"/>
-              <w:left w:val="single" w:color="999999" w:sz="4"/>
-              <w:bottom w:val="single" w:color="999999" w:sz="4"/>
-              <w:right w:val="single" w:color="999999" w:sz="4"/>
-            </w:tcBorders>
-            <w:tcMar>
-              <w:top w:type="dxa" w:w="50"/>
-              <w:left w:type="dxa" w:w="90"/>
-              <w:bottom w:type="dxa" w:w="50"/>
-              <w:right w:type="dxa" w:w="90"/>
-            </w:tcMar>
-          </w:tcPr>
-          <w:p>
-            <w:r>
-              <w:t xml:space="preserve">ICON_REPORT (or ICON_LIST)</w:t>
-            </w:r>
-          </w:p>
-        </w:tc>
-        <w:tc>
-          <w:tcPr>
-            <w:tcW w:type="dxa" w:w="1589"/>
-            <w:tcBorders>
-              <w:top w:val="single" w:color="999999" w:sz="4"/>
-              <w:left w:val="single" w:color="999999" w:sz="4"/>
-              <w:bottom w:val="single" w:color="999999" w:sz="4"/>
-              <w:right w:val="single" w:color="999999" w:sz="4"/>
-            </w:tcBorders>
-            <w:tcMar>
-              <w:top w:type="dxa" w:w="50"/>
-              <w:left w:type="dxa" w:w="90"/>
-              <w:bottom w:type="dxa" w:w="50"/>
-              <w:right w:type="dxa" w:w="90"/>
-            </w:tcMar>
-          </w:tcPr>
-          <w:p>
-            <w:r>
-              <w:t xml:space="preserve">FCST_REPORT</w:t>
-            </w:r>
-          </w:p>
-        </w:tc>
-        <w:tc>
-          <w:tcPr>
-            <w:tcW w:type="dxa" w:w="1490"/>
-            <w:tcBorders>
-              <w:top w:val="single" w:color="999999" w:sz="4"/>
-              <w:left w:val="single" w:color="999999" w:sz="4"/>
-              <w:bottom w:val="single" w:color="999999" w:sz="4"/>
-              <w:right w:val="single" w:color="999999" w:sz="4"/>
-            </w:tcBorders>
-            <w:tcMar>
-              <w:top w:type="dxa" w:w="50"/>
-              <w:left w:type="dxa" w:w="90"/>
-              <w:bottom w:type="dxa" w:w="50"/>
-              <w:right w:type="dxa" w:w="90"/>
-            </w:tcMar>
-          </w:tcPr>
-          <w:p>
-            <w:r>
-              <w:t xml:space="preserve">9 / 38</w:t>
             </w:r>
           </w:p>
         </w:tc>
@@ -2040,20 +1792,20 @@
           <w:b/>
           <w:bCs/>
         </w:rPr>
-        <w:t xml:space="preserve">names</w:t>
-      </w:r>
-      <w:r>
-        <w:t xml:space="preserve"> must be exactly FCST_CREATE, FCST_CHANGE and FCST_REPORT – HIDE_BUTTONS_0001 hides the buttons by name. The </w:t>
+        <w:t xml:space="preserve">name</w:t>
+      </w:r>
+      <w:r>
+        <w:t xml:space="preserve"> must be exactly FCST_MAIN (HIDE_BUTTONS_0001 hides it by name) and the </w:t>
       </w:r>
       <w:r>
         <w:rPr>
           <w:b/>
           <w:bCs/>
         </w:rPr>
-        <w:t xml:space="preserve">function codes</w:t>
-      </w:r>
-      <w:r>
-        <w:t xml:space="preserve"> must match the WHEN branches of USER_COMMAND_0001.</w:t>
+        <w:t xml:space="preserve">function code</w:t>
+      </w:r>
+      <w:r>
+        <w:t xml:space="preserve"> FCST_MAIN (WHEN branch of USER_COMMAND_0001).</w:t>
       </w:r>
     </w:p>
     <w:p>
@@ -2103,63 +1855,7 @@
           <w:sz w:val="15"/>
           <w:szCs w:val="15"/>
         </w:rPr>
-        <w:t xml:space="preserve">" ---- Budget Forecast buttons (added 07.10.2026) ----</w:t>
-      </w:r>
-    </w:p>
-    <w:p>
-      <w:pPr>
-        <w:shd w:fill="F2F2F2" w:color="auto" w:val="clear"/>
-        <w:spacing w:after="0" w:line="228"/>
-      </w:pPr>
-      <w:r>
-        <w:rPr>
-          <w:rFonts w:ascii="Courier New" w:cs="Courier New" w:eastAsia="Courier New" w:hAnsi="Courier New"/>
-          <w:sz w:val="15"/>
-          <w:szCs w:val="15"/>
-        </w:rPr>
-        <w:t xml:space="preserve">  "  Create Forecast : Budget Preparation creators (create role)</w:t>
-      </w:r>
-    </w:p>
-    <w:p>
-      <w:pPr>
-        <w:shd w:fill="F2F2F2" w:color="auto" w:val="clear"/>
-        <w:spacing w:after="0" w:line="228"/>
-      </w:pPr>
-      <w:r>
-        <w:rPr>
-          <w:rFonts w:ascii="Courier New" w:cs="Courier New" w:eastAsia="Courier New" w:hAnsi="Courier New"/>
-          <w:sz w:val="15"/>
-          <w:szCs w:val="15"/>
-        </w:rPr>
-        <w:t xml:space="preserve">  "  Change Forecast : creators, or a user who already created one</w:t>
-      </w:r>
-    </w:p>
-    <w:p>
-      <w:pPr>
-        <w:shd w:fill="F2F2F2" w:color="auto" w:val="clear"/>
-        <w:spacing w:after="0" w:line="228"/>
-      </w:pPr>
-      <w:r>
-        <w:rPr>
-          <w:rFonts w:ascii="Courier New" w:cs="Courier New" w:eastAsia="Courier New" w:hAnsi="Courier New"/>
-          <w:sz w:val="15"/>
-          <w:szCs w:val="15"/>
-        </w:rPr>
-        <w:t xml:space="preserve">  "  Forecast Report : Final Reviewers and FR assistants</w:t>
-      </w:r>
-    </w:p>
-    <w:p>
-      <w:pPr>
-        <w:shd w:fill="F2F2F2" w:color="auto" w:val="clear"/>
-        <w:spacing w:after="0" w:line="228"/>
-      </w:pPr>
-      <w:r>
-        <w:rPr>
-          <w:rFonts w:ascii="Courier New" w:cs="Courier New" w:eastAsia="Courier New" w:hAnsi="Courier New"/>
-          <w:sz w:val="15"/>
-          <w:szCs w:val="15"/>
-        </w:rPr>
-        <w:t xml:space="preserve">  "  The rules are in the Budget Forecast classes, not repeated here.</w:t>
+        <w:t xml:space="preserve">" ---- Budget Forecast button (added 08.10.2026) ----</w:t>
       </w:r>
     </w:p>
     <w:p>
@@ -2215,49 +1911,35 @@
           <w:sz w:val="15"/>
           <w:szCs w:val="15"/>
         </w:rPr>
-        <w:t xml:space="preserve">  DATA(lv_show_fcst_create) = lo_fcst_auth-&gt;is_creator( ).</w:t>
-      </w:r>
-    </w:p>
-    <w:p>
-      <w:pPr>
-        <w:shd w:fill="F2F2F2" w:color="auto" w:val="clear"/>
-        <w:spacing w:after="0" w:line="228"/>
-      </w:pPr>
-      <w:r>
-        <w:rPr>
-          <w:rFonts w:ascii="Courier New" w:cs="Courier New" w:eastAsia="Courier New" w:hAnsi="Courier New"/>
-          <w:sz w:val="15"/>
-          <w:szCs w:val="15"/>
-        </w:rPr>
-        <w:t xml:space="preserve">  DATA(lv_show_fcst_change) = xsdbool( lv_show_fcst_create = abap_true</w:t>
-      </w:r>
-    </w:p>
-    <w:p>
-      <w:pPr>
-        <w:shd w:fill="F2F2F2" w:color="auto" w:val="clear"/>
-        <w:spacing w:after="0" w:line="228"/>
-      </w:pPr>
-      <w:r>
-        <w:rPr>
-          <w:rFonts w:ascii="Courier New" w:cs="Courier New" w:eastAsia="Courier New" w:hAnsi="Courier New"/>
-          <w:sz w:val="15"/>
-          <w:szCs w:val="15"/>
-        </w:rPr>
-        <w:t xml:space="preserve">                                    OR lo_fcst_repo-&gt;user_has_forecast( sy-uname ) = abap_true ).</w:t>
-      </w:r>
-    </w:p>
-    <w:p>
-      <w:pPr>
-        <w:shd w:fill="F2F2F2" w:color="auto" w:val="clear"/>
-        <w:spacing w:after="0" w:line="228"/>
-      </w:pPr>
-      <w:r>
-        <w:rPr>
-          <w:rFonts w:ascii="Courier New" w:cs="Courier New" w:eastAsia="Courier New" w:hAnsi="Courier New"/>
-          <w:sz w:val="15"/>
-          <w:szCs w:val="15"/>
-        </w:rPr>
-        <w:t xml:space="preserve">  DATA(lv_show_fcst_report) = lo_fcst_auth-&gt;is_final_reviewer( ).</w:t>
+        <w:t xml:space="preserve">  DATA(lv_show_fcst) = xsdbool( lo_fcst_auth-&gt;is_creator( ) = abap_true</w:t>
+      </w:r>
+    </w:p>
+    <w:p>
+      <w:pPr>
+        <w:shd w:fill="F2F2F2" w:color="auto" w:val="clear"/>
+        <w:spacing w:after="0" w:line="228"/>
+      </w:pPr>
+      <w:r>
+        <w:rPr>
+          <w:rFonts w:ascii="Courier New" w:cs="Courier New" w:eastAsia="Courier New" w:hAnsi="Courier New"/>
+          <w:sz w:val="15"/>
+          <w:szCs w:val="15"/>
+        </w:rPr>
+        <w:t xml:space="preserve">                             OR lo_fcst_auth-&gt;is_final_reviewer( ) = abap_true</w:t>
+      </w:r>
+    </w:p>
+    <w:p>
+      <w:pPr>
+        <w:shd w:fill="F2F2F2" w:color="auto" w:val="clear"/>
+        <w:spacing w:after="0" w:line="228"/>
+      </w:pPr>
+      <w:r>
+        <w:rPr>
+          <w:rFonts w:ascii="Courier New" w:cs="Courier New" w:eastAsia="Courier New" w:hAnsi="Courier New"/>
+          <w:sz w:val="15"/>
+          <w:szCs w:val="15"/>
+        </w:rPr>
+        <w:t xml:space="preserve">                             OR lo_fcst_repo-&gt;user_has_forecast( sy-uname ) = abap_true ).</w:t>
       </w:r>
     </w:p>
     <w:p>
@@ -2285,147 +1967,105 @@
           <w:sz w:val="15"/>
           <w:szCs w:val="15"/>
         </w:rPr>
-        <w:t xml:space="preserve">  LOOP AT SCREEN INTO DATA(ls_fcst_screen).</w:t>
-      </w:r>
-    </w:p>
-    <w:p>
-      <w:pPr>
-        <w:shd w:fill="F2F2F2" w:color="auto" w:val="clear"/>
-        <w:spacing w:after="0" w:line="228"/>
-      </w:pPr>
-      <w:r>
-        <w:rPr>
-          <w:rFonts w:ascii="Courier New" w:cs="Courier New" w:eastAsia="Courier New" w:hAnsi="Courier New"/>
-          <w:sz w:val="15"/>
-          <w:szCs w:val="15"/>
-        </w:rPr>
-        <w:t xml:space="preserve">    DATA(lv_fcst_visible) = SWITCH abap_bool( ls_fcst_screen-name</w:t>
-      </w:r>
-    </w:p>
-    <w:p>
-      <w:pPr>
-        <w:shd w:fill="F2F2F2" w:color="auto" w:val="clear"/>
-        <w:spacing w:after="0" w:line="228"/>
-      </w:pPr>
-      <w:r>
-        <w:rPr>
-          <w:rFonts w:ascii="Courier New" w:cs="Courier New" w:eastAsia="Courier New" w:hAnsi="Courier New"/>
-          <w:sz w:val="15"/>
-          <w:szCs w:val="15"/>
-        </w:rPr>
-        <w:t xml:space="preserve">                              WHEN 'FCST_CREATE' THEN lv_show_fcst_create</w:t>
-      </w:r>
-    </w:p>
-    <w:p>
-      <w:pPr>
-        <w:shd w:fill="F2F2F2" w:color="auto" w:val="clear"/>
-        <w:spacing w:after="0" w:line="228"/>
-      </w:pPr>
-      <w:r>
-        <w:rPr>
-          <w:rFonts w:ascii="Courier New" w:cs="Courier New" w:eastAsia="Courier New" w:hAnsi="Courier New"/>
-          <w:sz w:val="15"/>
-          <w:szCs w:val="15"/>
-        </w:rPr>
-        <w:t xml:space="preserve">                              WHEN 'FCST_CHANGE' THEN lv_show_fcst_change</w:t>
-      </w:r>
-    </w:p>
-    <w:p>
-      <w:pPr>
-        <w:shd w:fill="F2F2F2" w:color="auto" w:val="clear"/>
-        <w:spacing w:after="0" w:line="228"/>
-      </w:pPr>
-      <w:r>
-        <w:rPr>
-          <w:rFonts w:ascii="Courier New" w:cs="Courier New" w:eastAsia="Courier New" w:hAnsi="Courier New"/>
-          <w:sz w:val="15"/>
-          <w:szCs w:val="15"/>
-        </w:rPr>
-        <w:t xml:space="preserve">                              WHEN 'FCST_REPORT' THEN lv_show_fcst_report</w:t>
-      </w:r>
-    </w:p>
-    <w:p>
-      <w:pPr>
-        <w:shd w:fill="F2F2F2" w:color="auto" w:val="clear"/>
-        <w:spacing w:after="0" w:line="228"/>
-      </w:pPr>
-      <w:r>
-        <w:rPr>
-          <w:rFonts w:ascii="Courier New" w:cs="Courier New" w:eastAsia="Courier New" w:hAnsi="Courier New"/>
-          <w:sz w:val="15"/>
-          <w:szCs w:val="15"/>
-        </w:rPr>
-        <w:t xml:space="preserve">                              ELSE abap_true ).</w:t>
-      </w:r>
-    </w:p>
-    <w:p>
-      <w:pPr>
-        <w:shd w:fill="F2F2F2" w:color="auto" w:val="clear"/>
-        <w:spacing w:after="0" w:line="228"/>
-      </w:pPr>
-      <w:r>
-        <w:rPr>
-          <w:rFonts w:ascii="Courier New" w:cs="Courier New" w:eastAsia="Courier New" w:hAnsi="Courier New"/>
-          <w:sz w:val="15"/>
-          <w:szCs w:val="15"/>
-        </w:rPr>
-        <w:t xml:space="preserve">    IF lv_fcst_visible = abap_false.</w:t>
-      </w:r>
-    </w:p>
-    <w:p>
-      <w:pPr>
-        <w:shd w:fill="F2F2F2" w:color="auto" w:val="clear"/>
-        <w:spacing w:after="0" w:line="228"/>
-      </w:pPr>
-      <w:r>
-        <w:rPr>
-          <w:rFonts w:ascii="Courier New" w:cs="Courier New" w:eastAsia="Courier New" w:hAnsi="Courier New"/>
-          <w:sz w:val="15"/>
-          <w:szCs w:val="15"/>
-        </w:rPr>
-        <w:t xml:space="preserve">      ls_fcst_screen-active = '0'.</w:t>
-      </w:r>
-    </w:p>
-    <w:p>
-      <w:pPr>
-        <w:shd w:fill="F2F2F2" w:color="auto" w:val="clear"/>
-        <w:spacing w:after="0" w:line="228"/>
-      </w:pPr>
-      <w:r>
-        <w:rPr>
-          <w:rFonts w:ascii="Courier New" w:cs="Courier New" w:eastAsia="Courier New" w:hAnsi="Courier New"/>
-          <w:sz w:val="15"/>
-          <w:szCs w:val="15"/>
-        </w:rPr>
-        <w:t xml:space="preserve">      MODIFY SCREEN FROM ls_fcst_screen.</w:t>
-      </w:r>
-    </w:p>
-    <w:p>
-      <w:pPr>
-        <w:shd w:fill="F2F2F2" w:color="auto" w:val="clear"/>
-        <w:spacing w:after="0" w:line="228"/>
-      </w:pPr>
-      <w:r>
-        <w:rPr>
-          <w:rFonts w:ascii="Courier New" w:cs="Courier New" w:eastAsia="Courier New" w:hAnsi="Courier New"/>
-          <w:sz w:val="15"/>
-          <w:szCs w:val="15"/>
-        </w:rPr>
-        <w:t xml:space="preserve">    ENDIF.</w:t>
-      </w:r>
-    </w:p>
-    <w:p>
-      <w:pPr>
-        <w:shd w:fill="F2F2F2" w:color="auto" w:val="clear"/>
-        <w:spacing w:after="0" w:line="228"/>
-      </w:pPr>
-      <w:r>
-        <w:rPr>
-          <w:rFonts w:ascii="Courier New" w:cs="Courier New" w:eastAsia="Courier New" w:hAnsi="Courier New"/>
-          <w:sz w:val="15"/>
-          <w:szCs w:val="15"/>
-        </w:rPr>
-        <w:t xml:space="preserve">  ENDLOOP.</w:t>
+        <w:t xml:space="preserve">  IF lv_show_fcst = abap_false.</w:t>
+      </w:r>
+    </w:p>
+    <w:p>
+      <w:pPr>
+        <w:shd w:fill="F2F2F2" w:color="auto" w:val="clear"/>
+        <w:spacing w:after="0" w:line="228"/>
+      </w:pPr>
+      <w:r>
+        <w:rPr>
+          <w:rFonts w:ascii="Courier New" w:cs="Courier New" w:eastAsia="Courier New" w:hAnsi="Courier New"/>
+          <w:sz w:val="15"/>
+          <w:szCs w:val="15"/>
+        </w:rPr>
+        <w:t xml:space="preserve">    LOOP AT SCREEN INTO DATA(ls_fcst_screen).</w:t>
+      </w:r>
+    </w:p>
+    <w:p>
+      <w:pPr>
+        <w:shd w:fill="F2F2F2" w:color="auto" w:val="clear"/>
+        <w:spacing w:after="0" w:line="228"/>
+      </w:pPr>
+      <w:r>
+        <w:rPr>
+          <w:rFonts w:ascii="Courier New" w:cs="Courier New" w:eastAsia="Courier New" w:hAnsi="Courier New"/>
+          <w:sz w:val="15"/>
+          <w:szCs w:val="15"/>
+        </w:rPr>
+        <w:t xml:space="preserve">      IF ls_fcst_screen-name = 'FCST_MAIN'.</w:t>
+      </w:r>
+    </w:p>
+    <w:p>
+      <w:pPr>
+        <w:shd w:fill="F2F2F2" w:color="auto" w:val="clear"/>
+        <w:spacing w:after="0" w:line="228"/>
+      </w:pPr>
+      <w:r>
+        <w:rPr>
+          <w:rFonts w:ascii="Courier New" w:cs="Courier New" w:eastAsia="Courier New" w:hAnsi="Courier New"/>
+          <w:sz w:val="15"/>
+          <w:szCs w:val="15"/>
+        </w:rPr>
+        <w:t xml:space="preserve">        ls_fcst_screen-active = '0'.</w:t>
+      </w:r>
+    </w:p>
+    <w:p>
+      <w:pPr>
+        <w:shd w:fill="F2F2F2" w:color="auto" w:val="clear"/>
+        <w:spacing w:after="0" w:line="228"/>
+      </w:pPr>
+      <w:r>
+        <w:rPr>
+          <w:rFonts w:ascii="Courier New" w:cs="Courier New" w:eastAsia="Courier New" w:hAnsi="Courier New"/>
+          <w:sz w:val="15"/>
+          <w:szCs w:val="15"/>
+        </w:rPr>
+        <w:t xml:space="preserve">        MODIFY SCREEN FROM ls_fcst_screen.</w:t>
+      </w:r>
+    </w:p>
+    <w:p>
+      <w:pPr>
+        <w:shd w:fill="F2F2F2" w:color="auto" w:val="clear"/>
+        <w:spacing w:after="0" w:line="228"/>
+      </w:pPr>
+      <w:r>
+        <w:rPr>
+          <w:rFonts w:ascii="Courier New" w:cs="Courier New" w:eastAsia="Courier New" w:hAnsi="Courier New"/>
+          <w:sz w:val="15"/>
+          <w:szCs w:val="15"/>
+        </w:rPr>
+        <w:t xml:space="preserve">      ENDIF.</w:t>
+      </w:r>
+    </w:p>
+    <w:p>
+      <w:pPr>
+        <w:shd w:fill="F2F2F2" w:color="auto" w:val="clear"/>
+        <w:spacing w:after="0" w:line="228"/>
+      </w:pPr>
+      <w:r>
+        <w:rPr>
+          <w:rFonts w:ascii="Courier New" w:cs="Courier New" w:eastAsia="Courier New" w:hAnsi="Courier New"/>
+          <w:sz w:val="15"/>
+          <w:szCs w:val="15"/>
+        </w:rPr>
+        <w:t xml:space="preserve">    ENDLOOP.</w:t>
+      </w:r>
+    </w:p>
+    <w:p>
+      <w:pPr>
+        <w:shd w:fill="F2F2F2" w:color="auto" w:val="clear"/>
+        <w:spacing w:after="0" w:line="228"/>
+      </w:pPr>
+      <w:r>
+        <w:rPr>
+          <w:rFonts w:ascii="Courier New" w:cs="Courier New" w:eastAsia="Courier New" w:hAnsi="Courier New"/>
+          <w:sz w:val="15"/>
+          <w:szCs w:val="15"/>
+        </w:rPr>
+        <w:t xml:space="preserve">  ENDIF.</w:t>
       </w:r>
     </w:p>
     <w:p>
@@ -2541,7 +2181,7 @@
           </w:tcPr>
           <w:p>
             <w:r>
-              <w:t xml:space="preserve">Create Forecast</w:t>
+              <w:t xml:space="preserve">Budget Forecast</w:t>
             </w:r>
           </w:p>
         </w:tc>
@@ -2563,99 +2203,7 @@
           </w:tcPr>
           <w:p>
             <w:r>
-              <w:t xml:space="preserve">Budget Preparation creators (ZBUD_CREATORS role CRE, C&amp;M, CMD or ALL, active and valid)</w:t>
-            </w:r>
-          </w:p>
-        </w:tc>
-      </w:tr>
-      <w:tr>
-        <w:tc>
-          <w:tcPr>
-            <w:tcW w:type="dxa" w:w="2484"/>
-            <w:tcBorders>
-              <w:top w:val="single" w:color="999999" w:sz="4"/>
-              <w:left w:val="single" w:color="999999" w:sz="4"/>
-              <w:bottom w:val="single" w:color="999999" w:sz="4"/>
-              <w:right w:val="single" w:color="999999" w:sz="4"/>
-            </w:tcBorders>
-            <w:tcMar>
-              <w:top w:type="dxa" w:w="50"/>
-              <w:left w:type="dxa" w:w="90"/>
-              <w:bottom w:type="dxa" w:w="50"/>
-              <w:right w:type="dxa" w:w="90"/>
-            </w:tcMar>
-          </w:tcPr>
-          <w:p>
-            <w:r>
-              <w:t xml:space="preserve">Change Forecast</w:t>
-            </w:r>
-          </w:p>
-        </w:tc>
-        <w:tc>
-          <w:tcPr>
-            <w:tcW w:type="dxa" w:w="7452"/>
-            <w:tcBorders>
-              <w:top w:val="single" w:color="999999" w:sz="4"/>
-              <w:left w:val="single" w:color="999999" w:sz="4"/>
-              <w:bottom w:val="single" w:color="999999" w:sz="4"/>
-              <w:right w:val="single" w:color="999999" w:sz="4"/>
-            </w:tcBorders>
-            <w:tcMar>
-              <w:top w:type="dxa" w:w="50"/>
-              <w:left w:type="dxa" w:w="90"/>
-              <w:bottom w:type="dxa" w:w="50"/>
-              <w:right w:type="dxa" w:w="90"/>
-            </w:tcMar>
-          </w:tcPr>
-          <w:p>
-            <w:r>
-              <w:t xml:space="preserve">The same creators, or a user who has already created a forecast</w:t>
-            </w:r>
-          </w:p>
-        </w:tc>
-      </w:tr>
-      <w:tr>
-        <w:tc>
-          <w:tcPr>
-            <w:tcW w:type="dxa" w:w="2484"/>
-            <w:tcBorders>
-              <w:top w:val="single" w:color="999999" w:sz="4"/>
-              <w:left w:val="single" w:color="999999" w:sz="4"/>
-              <w:bottom w:val="single" w:color="999999" w:sz="4"/>
-              <w:right w:val="single" w:color="999999" w:sz="4"/>
-            </w:tcBorders>
-            <w:tcMar>
-              <w:top w:type="dxa" w:w="50"/>
-              <w:left w:type="dxa" w:w="90"/>
-              <w:bottom w:type="dxa" w:w="50"/>
-              <w:right w:type="dxa" w:w="90"/>
-            </w:tcMar>
-          </w:tcPr>
-          <w:p>
-            <w:r>
-              <w:t xml:space="preserve">Forecast Report</w:t>
-            </w:r>
-          </w:p>
-        </w:tc>
-        <w:tc>
-          <w:tcPr>
-            <w:tcW w:type="dxa" w:w="7452"/>
-            <w:tcBorders>
-              <w:top w:val="single" w:color="999999" w:sz="4"/>
-              <w:left w:val="single" w:color="999999" w:sz="4"/>
-              <w:bottom w:val="single" w:color="999999" w:sz="4"/>
-              <w:right w:val="single" w:color="999999" w:sz="4"/>
-            </w:tcBorders>
-            <w:tcMar>
-              <w:top w:type="dxa" w:w="50"/>
-              <w:left w:type="dxa" w:w="90"/>
-              <w:bottom w:type="dxa" w:w="50"/>
-              <w:right w:type="dxa" w:w="90"/>
-            </w:tcMar>
-          </w:tcPr>
-          <w:p>
-            <w:r>
-              <w:t xml:space="preserve">Final Reviewers (ZFI_BUD_WF_AGENT level FR) and Final Reviewer Assistants (ZFIBUD_ASSISTANT)</w:t>
+              <w:t xml:space="preserve">Creators (ZBUD_CREATORS role CRE, C&amp;M, CMD or ALL), users who already created a forecast, Final Reviewers (ZFI_BUD_WF_AGENT level FR) and Final Reviewer Assistants (ZFIBUD_ASSISTANT). Which function each user gets is decided on the menu of the new program.</w:t>
             </w:r>
           </w:p>
         </w:tc>
@@ -2689,7 +2237,7 @@
         <w:t xml:space="preserve">USER_COMMAND_0001</w:t>
       </w:r>
       <w:r>
-        <w:t xml:space="preserve"> – paste the three branches inside </w:t>
+        <w:t xml:space="preserve"> – paste the new branch inside </w:t>
       </w:r>
       <w:r>
         <w:rPr>
@@ -2723,21 +2271,21 @@
           <w:sz w:val="15"/>
           <w:szCs w:val="15"/>
         </w:rPr>
-        <w:t xml:space="preserve">" ---- Budget Forecast (added 07.10.2026) ----</w:t>
-      </w:r>
-    </w:p>
-    <w:p>
-      <w:pPr>
-        <w:shd w:fill="F2F2F2" w:color="auto" w:val="clear"/>
-        <w:spacing w:after="0" w:line="228"/>
-      </w:pPr>
-      <w:r>
-        <w:rPr>
-          <w:rFonts w:ascii="Courier New" w:cs="Courier New" w:eastAsia="Courier New" w:hAnsi="Courier New"/>
-          <w:sz w:val="15"/>
-          <w:szCs w:val="15"/>
-        </w:rPr>
-        <w:t xml:space="preserve">    WHEN 'FCST_CREATE'.</w:t>
+        <w:t xml:space="preserve">" ---- Budget Forecast (added 08.10.2026) ----</w:t>
+      </w:r>
+    </w:p>
+    <w:p>
+      <w:pPr>
+        <w:shd w:fill="F2F2F2" w:color="auto" w:val="clear"/>
+        <w:spacing w:after="0" w:line="228"/>
+      </w:pPr>
+      <w:r>
+        <w:rPr>
+          <w:rFonts w:ascii="Courier New" w:cs="Courier New" w:eastAsia="Courier New" w:hAnsi="Courier New"/>
+          <w:sz w:val="15"/>
+          <w:szCs w:val="15"/>
+        </w:rPr>
+        <w:t xml:space="preserve">    WHEN 'FCST_MAIN'.</w:t>
       </w:r>
     </w:p>
     <w:p>
@@ -2765,7 +2313,7 @@
           <w:sz w:val="15"/>
           <w:szCs w:val="15"/>
         </w:rPr>
-        <w:t xml:space="preserve">          CALL TRANSACTION 'ZFI_BUD_2YF_C' WITH AUTHORITY-CHECK.</w:t>
+        <w:t xml:space="preserve">          CALL TRANSACTION 'ZFI_BUD_2YF' WITH AUTHORITY-CHECK.</w:t>
       </w:r>
     </w:p>
     <w:p>
@@ -2793,7 +2341,7 @@
           <w:sz w:val="15"/>
           <w:szCs w:val="15"/>
         </w:rPr>
-        <w:t xml:space="preserve">          MESSAGE 'You are not authorized for transaction ZFI_BUD_2YF_C'</w:t>
+        <w:t xml:space="preserve">          MESSAGE 'You are not authorized for transaction ZFI_BUD_2YF'</w:t>
       </w:r>
     </w:p>
     <w:p>
@@ -2835,202 +2383,6 @@
           <w:sz w:val="15"/>
           <w:szCs w:val="15"/>
         </w:rPr>
-        <w:t xml:space="preserve">    WHEN 'FCST_CHANGE'.</w:t>
-      </w:r>
-    </w:p>
-    <w:p>
-      <w:pPr>
-        <w:shd w:fill="F2F2F2" w:color="auto" w:val="clear"/>
-        <w:spacing w:after="0" w:line="228"/>
-      </w:pPr>
-      <w:r>
-        <w:rPr>
-          <w:rFonts w:ascii="Courier New" w:cs="Courier New" w:eastAsia="Courier New" w:hAnsi="Courier New"/>
-          <w:sz w:val="15"/>
-          <w:szCs w:val="15"/>
-        </w:rPr>
-        <w:t xml:space="preserve">      TRY.</w:t>
-      </w:r>
-    </w:p>
-    <w:p>
-      <w:pPr>
-        <w:shd w:fill="F2F2F2" w:color="auto" w:val="clear"/>
-        <w:spacing w:after="0" w:line="228"/>
-      </w:pPr>
-      <w:r>
-        <w:rPr>
-          <w:rFonts w:ascii="Courier New" w:cs="Courier New" w:eastAsia="Courier New" w:hAnsi="Courier New"/>
-          <w:sz w:val="15"/>
-          <w:szCs w:val="15"/>
-        </w:rPr>
-        <w:t xml:space="preserve">          CALL TRANSACTION 'ZFI_BUD_2YF_M' WITH AUTHORITY-CHECK.</w:t>
-      </w:r>
-    </w:p>
-    <w:p>
-      <w:pPr>
-        <w:shd w:fill="F2F2F2" w:color="auto" w:val="clear"/>
-        <w:spacing w:after="0" w:line="228"/>
-      </w:pPr>
-      <w:r>
-        <w:rPr>
-          <w:rFonts w:ascii="Courier New" w:cs="Courier New" w:eastAsia="Courier New" w:hAnsi="Courier New"/>
-          <w:sz w:val="15"/>
-          <w:szCs w:val="15"/>
-        </w:rPr>
-        <w:t xml:space="preserve">        CATCH CX_SY_AUTHORIZATION_ERROR.</w:t>
-      </w:r>
-    </w:p>
-    <w:p>
-      <w:pPr>
-        <w:shd w:fill="F2F2F2" w:color="auto" w:val="clear"/>
-        <w:spacing w:after="0" w:line="228"/>
-      </w:pPr>
-      <w:r>
-        <w:rPr>
-          <w:rFonts w:ascii="Courier New" w:cs="Courier New" w:eastAsia="Courier New" w:hAnsi="Courier New"/>
-          <w:sz w:val="15"/>
-          <w:szCs w:val="15"/>
-        </w:rPr>
-        <w:t xml:space="preserve">          MESSAGE 'You are not authorized for transaction ZFI_BUD_2YF_M'</w:t>
-      </w:r>
-    </w:p>
-    <w:p>
-      <w:pPr>
-        <w:shd w:fill="F2F2F2" w:color="auto" w:val="clear"/>
-        <w:spacing w:after="0" w:line="228"/>
-      </w:pPr>
-      <w:r>
-        <w:rPr>
-          <w:rFonts w:ascii="Courier New" w:cs="Courier New" w:eastAsia="Courier New" w:hAnsi="Courier New"/>
-          <w:sz w:val="15"/>
-          <w:szCs w:val="15"/>
-        </w:rPr>
-        <w:t xml:space="preserve">                  TYPE 'S' DISPLAY LIKE 'E'.</w:t>
-      </w:r>
-    </w:p>
-    <w:p>
-      <w:pPr>
-        <w:shd w:fill="F2F2F2" w:color="auto" w:val="clear"/>
-        <w:spacing w:after="0" w:line="228"/>
-      </w:pPr>
-      <w:r>
-        <w:rPr>
-          <w:rFonts w:ascii="Courier New" w:cs="Courier New" w:eastAsia="Courier New" w:hAnsi="Courier New"/>
-          <w:sz w:val="15"/>
-          <w:szCs w:val="15"/>
-        </w:rPr>
-        <w:t xml:space="preserve">      ENDTRY.</w:t>
-      </w:r>
-    </w:p>
-    <w:p>
-      <w:pPr>
-        <w:shd w:fill="F2F2F2" w:color="auto" w:val="clear"/>
-        <w:spacing w:after="0" w:line="228"/>
-      </w:pPr>
-      <w:r>
-        <w:rPr>
-          <w:rFonts w:ascii="Courier New" w:cs="Courier New" w:eastAsia="Courier New" w:hAnsi="Courier New"/>
-          <w:sz w:val="15"/>
-          <w:szCs w:val="15"/>
-        </w:rPr>
-        <w:t xml:space="preserve">    WHEN 'FCST_REPORT'.</w:t>
-      </w:r>
-    </w:p>
-    <w:p>
-      <w:pPr>
-        <w:shd w:fill="F2F2F2" w:color="auto" w:val="clear"/>
-        <w:spacing w:after="0" w:line="228"/>
-      </w:pPr>
-      <w:r>
-        <w:rPr>
-          <w:rFonts w:ascii="Courier New" w:cs="Courier New" w:eastAsia="Courier New" w:hAnsi="Courier New"/>
-          <w:sz w:val="15"/>
-          <w:szCs w:val="15"/>
-        </w:rPr>
-        <w:t xml:space="preserve">      TRY.</w:t>
-      </w:r>
-    </w:p>
-    <w:p>
-      <w:pPr>
-        <w:shd w:fill="F2F2F2" w:color="auto" w:val="clear"/>
-        <w:spacing w:after="0" w:line="228"/>
-      </w:pPr>
-      <w:r>
-        <w:rPr>
-          <w:rFonts w:ascii="Courier New" w:cs="Courier New" w:eastAsia="Courier New" w:hAnsi="Courier New"/>
-          <w:sz w:val="15"/>
-          <w:szCs w:val="15"/>
-        </w:rPr>
-        <w:t xml:space="preserve">          CALL TRANSACTION 'ZFI_BUD_2YF_R' WITH AUTHORITY-CHECK.</w:t>
-      </w:r>
-    </w:p>
-    <w:p>
-      <w:pPr>
-        <w:shd w:fill="F2F2F2" w:color="auto" w:val="clear"/>
-        <w:spacing w:after="0" w:line="228"/>
-      </w:pPr>
-      <w:r>
-        <w:rPr>
-          <w:rFonts w:ascii="Courier New" w:cs="Courier New" w:eastAsia="Courier New" w:hAnsi="Courier New"/>
-          <w:sz w:val="15"/>
-          <w:szCs w:val="15"/>
-        </w:rPr>
-        <w:t xml:space="preserve">        CATCH CX_SY_AUTHORIZATION_ERROR.</w:t>
-      </w:r>
-    </w:p>
-    <w:p>
-      <w:pPr>
-        <w:shd w:fill="F2F2F2" w:color="auto" w:val="clear"/>
-        <w:spacing w:after="0" w:line="228"/>
-      </w:pPr>
-      <w:r>
-        <w:rPr>
-          <w:rFonts w:ascii="Courier New" w:cs="Courier New" w:eastAsia="Courier New" w:hAnsi="Courier New"/>
-          <w:sz w:val="15"/>
-          <w:szCs w:val="15"/>
-        </w:rPr>
-        <w:t xml:space="preserve">          MESSAGE 'You are not authorized for transaction ZFI_BUD_2YF_R'</w:t>
-      </w:r>
-    </w:p>
-    <w:p>
-      <w:pPr>
-        <w:shd w:fill="F2F2F2" w:color="auto" w:val="clear"/>
-        <w:spacing w:after="0" w:line="228"/>
-      </w:pPr>
-      <w:r>
-        <w:rPr>
-          <w:rFonts w:ascii="Courier New" w:cs="Courier New" w:eastAsia="Courier New" w:hAnsi="Courier New"/>
-          <w:sz w:val="15"/>
-          <w:szCs w:val="15"/>
-        </w:rPr>
-        <w:t xml:space="preserve">                  TYPE 'S' DISPLAY LIKE 'E'.</w:t>
-      </w:r>
-    </w:p>
-    <w:p>
-      <w:pPr>
-        <w:shd w:fill="F2F2F2" w:color="auto" w:val="clear"/>
-        <w:spacing w:after="0" w:line="228"/>
-      </w:pPr>
-      <w:r>
-        <w:rPr>
-          <w:rFonts w:ascii="Courier New" w:cs="Courier New" w:eastAsia="Courier New" w:hAnsi="Courier New"/>
-          <w:sz w:val="15"/>
-          <w:szCs w:val="15"/>
-        </w:rPr>
-        <w:t xml:space="preserve">      ENDTRY.</w:t>
-      </w:r>
-    </w:p>
-    <w:p>
-      <w:pPr>
-        <w:shd w:fill="F2F2F2" w:color="auto" w:val="clear"/>
-        <w:spacing w:after="0" w:line="228"/>
-      </w:pPr>
-      <w:r>
-        <w:rPr>
-          <w:rFonts w:ascii="Courier New" w:cs="Courier New" w:eastAsia="Courier New" w:hAnsi="Courier New"/>
-          <w:sz w:val="15"/>
-          <w:szCs w:val="15"/>
-        </w:rPr>
         <w:t xml:space="preserve">    " ---- END Budget Forecast ----</w:t>
       </w:r>
     </w:p>
@@ -3282,35 +2634,7 @@
           <w:sz w:val="15"/>
           <w:szCs w:val="15"/>
         </w:rPr>
-        <w:t xml:space="preserve">    WHEN 'FCST_CREATE'.  ...                 "new</w:t>
-      </w:r>
-    </w:p>
-    <w:p>
-      <w:pPr>
-        <w:shd w:fill="F2F2F2" w:color="auto" w:val="clear"/>
-        <w:spacing w:after="0" w:line="228"/>
-      </w:pPr>
-      <w:r>
-        <w:rPr>
-          <w:rFonts w:ascii="Courier New" w:cs="Courier New" w:eastAsia="Courier New" w:hAnsi="Courier New"/>
-          <w:sz w:val="15"/>
-          <w:szCs w:val="15"/>
-        </w:rPr>
-        <w:t xml:space="preserve">    WHEN 'FCST_CHANGE'.  ...                 "new</w:t>
-      </w:r>
-    </w:p>
-    <w:p>
-      <w:pPr>
-        <w:shd w:fill="F2F2F2" w:color="auto" w:val="clear"/>
-        <w:spacing w:after="0" w:line="228"/>
-      </w:pPr>
-      <w:r>
-        <w:rPr>
-          <w:rFonts w:ascii="Courier New" w:cs="Courier New" w:eastAsia="Courier New" w:hAnsi="Courier New"/>
-          <w:sz w:val="15"/>
-          <w:szCs w:val="15"/>
-        </w:rPr>
-        <w:t xml:space="preserve">    WHEN 'FCST_REPORT'.  ...                 "new</w:t>
+        <w:t xml:space="preserve">    WHEN 'FCST_MAIN'.    ...                 "new: CALL TRANSACTION 'ZFI_BUD_2YF'</w:t>
       </w:r>
     </w:p>
     <w:p>
@@ -3387,7 +2711,7 @@
           <w:sz w:val="15"/>
           <w:szCs w:val="15"/>
         </w:rPr>
-        <w:t xml:space="preserve">*&amp; 1.1 | 08.10.2026 | Hassan Diab   | &lt;TBD&gt;        | Budget Forecast buttons.</w:t>
+        <w:t xml:space="preserve">*&amp; 1.1 | 08.10.2026 | Hassan Diab   | &lt;TBD&gt;        | Budget Forecast button.</w:t>
       </w:r>
     </w:p>
     <w:p>
@@ -3658,7 +2982,7 @@
         <w:spacing w:after="60"/>
       </w:pPr>
       <w:r>
-        <w:t xml:space="preserve">PFCG: add ZFI_BUD_2YF_C, ZFI_BUD_2YF_M and ZFI_BUD_2YF_R (authorization object S_TCODE) to the role(s) that already contain ZFI_BUDGET_PRE.</w:t>
+        <w:t xml:space="preserve">PFCG: add ZFI_BUD_2YF (authorization object S_TCODE) to the role(s) that already contain ZFI_BUDGET_PRE. The menu calls screen 0100 and the report inside the same program, so no further transaction is needed.</w:t>
       </w:r>
     </w:p>
     <w:p>
@@ -3684,7 +3008,7 @@
         <w:spacing w:after="60"/>
       </w:pPr>
       <w:r>
-        <w:t xml:space="preserve">The buttons call the transactions WITH AUTHORITY-CHECK: a user without the transaction in his role gets the message "You are not authorized for transaction …" instead of a dump.</w:t>
+        <w:t xml:space="preserve">The button calls the transaction WITH AUTHORITY-CHECK: a user without ZFI_BUD_2YF in his role gets the message "You are not authorized for transaction ZFI_BUD_2YF" instead of a dump.</w:t>
       </w:r>
     </w:p>
     <w:p>
@@ -3861,7 +3185,7 @@
           </w:tcPr>
           <w:p>
             <w:r>
-              <w:t xml:space="preserve">Existing buttons as before + Create Forecast and Change Forecast; no Forecast Report</w:t>
+              <w:t xml:space="preserve">Existing buttons as before + Budget Forecast</w:t>
             </w:r>
           </w:p>
         </w:tc>
@@ -3907,7 +3231,7 @@
           </w:tcPr>
           <w:p>
             <w:r>
-              <w:t xml:space="preserve">Final Reviewer (not creator) opens ZFI_BUDGET_PRE</w:t>
+              <w:t xml:space="preserve">Creator clicks Budget Forecast</w:t>
             </w:r>
           </w:p>
         </w:tc>
@@ -3929,7 +3253,7 @@
           </w:tcPr>
           <w:p>
             <w:r>
-              <w:t xml:space="preserve">Existing buttons as before + Forecast Report only</w:t>
+              <w:t xml:space="preserve">Menu of ZFI_BUD_2YF: Create Budget Forecast and Display / Modify Budget Forecast; no Forecast Report</w:t>
             </w:r>
           </w:p>
         </w:tc>
@@ -3975,7 +3299,7 @@
           </w:tcPr>
           <w:p>
             <w:r>
-              <w:t xml:space="preserve">Final Reviewer Assistant opens ZFI_BUDGET_PRE</w:t>
+              <w:t xml:space="preserve">Final Reviewer / Assistant clicks Budget Forecast</w:t>
             </w:r>
           </w:p>
         </w:tc>
@@ -3997,7 +3321,7 @@
           </w:tcPr>
           <w:p>
             <w:r>
-              <w:t xml:space="preserve">Forecast Report visible</w:t>
+              <w:t xml:space="preserve">Menu shows Forecast Report only</w:t>
             </w:r>
           </w:p>
         </w:tc>
@@ -4043,7 +3367,7 @@
           </w:tcPr>
           <w:p>
             <w:r>
-              <w:t xml:space="preserve">Click Create Forecast</w:t>
+              <w:t xml:space="preserve">User without any forecast role opens ZFI_BUDGET_PRE</w:t>
             </w:r>
           </w:p>
         </w:tc>
@@ -4065,7 +3389,7 @@
           </w:tcPr>
           <w:p>
             <w:r>
-              <w:t xml:space="preserve">ZFI_BUD_2YF_C opens (Create Budget Forecast); Back returns to screen 0001</w:t>
+              <w:t xml:space="preserve">Budget Forecast button not visible</w:t>
             </w:r>
           </w:p>
         </w:tc>
@@ -4111,7 +3435,7 @@
           </w:tcPr>
           <w:p>
             <w:r>
-              <w:t xml:space="preserve">Click Change Forecast</w:t>
+              <w:t xml:space="preserve">Back on the menu</w:t>
             </w:r>
           </w:p>
         </w:tc>
@@ -4133,7 +3457,7 @@
           </w:tcPr>
           <w:p>
             <w:r>
-              <w:t xml:space="preserve">ZFI_BUD_2YF_M opens (Modify Budget Forecast)</w:t>
+              <w:t xml:space="preserve">Returns to screen 0001 of ZFI_BUDGET_PRE</w:t>
             </w:r>
           </w:p>
         </w:tc>
@@ -4179,7 +3503,7 @@
           </w:tcPr>
           <w:p>
             <w:r>
-              <w:t xml:space="preserve">Click Forecast Report</w:t>
+              <w:t xml:space="preserve">Save / Back on the forecast screen</w:t>
             </w:r>
           </w:p>
         </w:tc>
@@ -4201,7 +3525,7 @@
           </w:tcPr>
           <w:p>
             <w:r>
-              <w:t xml:space="preserve">Selection screen of ZFI_BUD_2YF_R</w:t>
+              <w:t xml:space="preserve">Returns to the forecast menu</w:t>
             </w:r>
           </w:p>
         </w:tc>
@@ -4247,7 +3571,7 @@
           </w:tcPr>
           <w:p>
             <w:r>
-              <w:t xml:space="preserve">User without the new transactions in his role clicks a button</w:t>
+              <w:t xml:space="preserve">User without ZFI_BUD_2YF in his role clicks Budget Forecast</w:t>
             </w:r>
           </w:p>
         </w:tc>
@@ -4269,7 +3593,7 @@
           </w:tcPr>
           <w:p>
             <w:r>
-              <w:t xml:space="preserve">Message "You are not authorized for transaction …", no dump</w:t>
+              <w:t xml:space="preserve">Message "You are not authorized for transaction ZFI_BUD_2YF", no dump</w:t>
             </w:r>
           </w:p>
         </w:tc>
@@ -4366,7 +3690,7 @@
         <w:spacing w:after="60"/>
       </w:pPr>
       <w:r>
-        <w:t xml:space="preserve">Delete the block between "---- Budget Forecast buttons" and "---- END Budget Forecast ----" in HIDE_BUTTONS_0001.</w:t>
+        <w:t xml:space="preserve">Delete the block between "---- Budget Forecast button" and "---- END Budget Forecast ----" in HIDE_BUTTONS_0001.</w:t>
       </w:r>
     </w:p>
     <w:p>
@@ -4379,7 +3703,7 @@
         <w:spacing w:after="60"/>
       </w:pPr>
       <w:r>
-        <w:t xml:space="preserve">Delete the three WHEN branches FCST_CREATE / FCST_CHANGE / FCST_REPORT in USER_COMMAND_0001.</w:t>
+        <w:t xml:space="preserve">Delete the WHEN branch FCST_MAIN in USER_COMMAND_0001.</w:t>
       </w:r>
     </w:p>
     <w:p>
@@ -4392,7 +3716,7 @@
         <w:spacing w:after="60"/>
       </w:pPr>
       <w:r>
-        <w:t xml:space="preserve">Upload the screen 0001 backup from step 1 (or delete the frame and the three buttons).</w:t>
+        <w:t xml:space="preserve">Upload the screen 0001 backup from step 1 (or delete the frame and the button).</w:t>
       </w:r>
     </w:p>
     <w:p>
@@ -4554,7 +3878,7 @@
         <w:sz w:val="16"/>
         <w:szCs w:val="16"/>
       </w:rPr>
-      <w:t xml:space="preserve">Change Document – ZFI_BUDGET_PREPERATION (Budget Forecast connection)</w:t>
+      <w:t xml:space="preserve">Change Document – ZFI_BUDGET_PREPERATION (Budget Forecast button)</w:t>
     </w:r>
   </w:p>
 </w:hdr>

</xml_diff>